<commit_message>
Capabilities two-column alignment fix
</commit_message>
<xml_diff>
--- a/artifacts/portfolio/public/Alan_Ponton_Resume.docx
+++ b/artifacts/portfolio/public/Alan_Ponton_Resume.docx
@@ -80,7 +80,7 @@
           <w:sz w:val="19"/>
           <w:szCs w:val="19"/>
         </w:rPr>
-        <w:t xml:space="preserve">Product-minded UX designer who owns the full arc — research framing, information architecture, interaction and visual design, content and conversation design, accessibility — and ships the production build. I design for real users under real constraints, put the work in front of them, and iterate. Two end-to-end case studies carry the story: a productized travel platform built under severe constraint, and a security-operations tool taken through three documented versions including a self-correction reversing my own work in users’ favor. Google UX Design and Meta Front-End certified. AI-augmented development is my force multiplier: it lets one designer carry an idea from research to a live, maintained product.</w:t>
+        <w:t xml:space="preserve">Product-minded UX designer who owns the full arc: research, information architecture, interaction and visual design, and the production build. I design for real users under real constraints, ship, and iterate. Two end-to-end case studies carry the story. One is a productized travel platform built under severe constraint. The other is a security operations tool taken through three documented versions. Google UX Design and Meta Front-End certified. AI-augmented development is my force multiplier. It lets one designer carry an idea from research to a live, maintained product.</w:t>
       </w:r>
     </w:p>
     <w:p>
@@ -199,7 +199,7 @@
           <w:sz w:val="18"/>
           <w:szCs w:val="18"/>
         </w:rPr>
-        <w:t xml:space="preserve">Caught and reversed my own designer-imposition failure — had designed an aspirational itinerary over the client’s actual chosen plans — and made “design for who the user is, not who I assume they should be” a governing principle.</w:t>
+        <w:t xml:space="preserve">Caught and reversed my own designer-imposition failure. I had designed an aspirational itinerary over the client’s actual chosen plans, and made “design for who the user is, not who I assume they should be” a governing principle.</w:t>
       </w:r>
     </w:p>
     <w:p>
@@ -333,79 +333,79 @@
           <w:sz w:val="18"/>
           <w:szCs w:val="18"/>
         </w:rPr>
-        <w:t xml:space="preserve">Derived design constraints from direct observation of officers using the old site in real conditions — low light, one-handed, mid-patrol — turning friction points into hard requirements (dark-by-default, high-contrast, no horizontal scroll).</w:t>
-      </w:r>
-    </w:p>
-    <w:p>
-      <w:pPr>
-        <w:pStyle w:val="ListParagraph"/>
-        <w:numPr>
-          <w:ilvl w:val="0"/>
-          <w:numId w:val="2"/>
-        </w:numPr>
-        <w:spacing w:after="80"/>
-      </w:pPr>
-      <w:r>
-        <w:rPr>
-          <w:rFonts w:ascii="Arial" w:cs="Arial" w:eastAsia="Arial" w:hAnsi="Arial"/>
-          <w:sz w:val="18"/>
-          <w:szCs w:val="18"/>
-        </w:rPr>
-        <w:t xml:space="preserve">V1 → V2 self-correction: my own visually-impressive dark theme tested as unreadable on a long shift; I reversed it, stripping styling back and prioritizing readability over aesthetics based on user feedback.</w:t>
-      </w:r>
-    </w:p>
-    <w:p>
-      <w:pPr>
-        <w:pStyle w:val="ListParagraph"/>
-        <w:numPr>
-          <w:ilvl w:val="0"/>
-          <w:numId w:val="2"/>
-        </w:numPr>
-        <w:spacing w:after="80"/>
-      </w:pPr>
-      <w:r>
-        <w:rPr>
-          <w:rFonts w:ascii="Arial" w:cs="Arial" w:eastAsia="Arial" w:hAnsi="Arial"/>
-          <w:sz w:val="18"/>
-          <w:szCs w:val="18"/>
-        </w:rPr>
-        <w:t xml:space="preserve">Designed the access model around a governing principle drawn from a failed chat-tool rollout (“zero-friction access beats feature richness”): a passwordless guard-picker identity layer — no email, no app store, under five seconds.</w:t>
-      </w:r>
-    </w:p>
-    <w:p>
-      <w:pPr>
-        <w:pStyle w:val="ListParagraph"/>
-        <w:numPr>
-          <w:ilvl w:val="0"/>
-          <w:numId w:val="2"/>
-        </w:numPr>
-        <w:spacing w:after="80"/>
-      </w:pPr>
-      <w:r>
-        <w:rPr>
-          <w:rFonts w:ascii="Arial" w:cs="Arial" w:eastAsia="Arial" w:hAnsi="Arial"/>
-          <w:sz w:val="18"/>
-          <w:szCs w:val="18"/>
-        </w:rPr>
-        <w:t xml:space="preserve">Inverse design judgment: deliberately added friction — employee-ID re-entry to confirm fire-extinguisher inspections — because a careless tap on a safety record is real-world harm, not a UI annoyance.</w:t>
-      </w:r>
-    </w:p>
-    <w:p>
-      <w:pPr>
-        <w:pStyle w:val="ListParagraph"/>
-        <w:numPr>
-          <w:ilvl w:val="0"/>
-          <w:numId w:val="2"/>
-        </w:numPr>
-        <w:spacing w:after="80"/>
-      </w:pPr>
-      <w:r>
-        <w:rPr>
-          <w:rFonts w:ascii="Arial" w:cs="Arial" w:eastAsia="Arial" w:hAnsi="Arial"/>
-          <w:sz w:val="18"/>
-          <w:szCs w:val="18"/>
-        </w:rPr>
-        <w:t xml:space="preserve">Constraint-based scheduling engine honoring 5–7 simultaneous rules; rebuilt the data architecture after a decoupling bug, adopting incremental single-transformation validation as a method.</w:t>
+        <w:t xml:space="preserve">Derived design constraints from direct observation of officers using the old site in real conditions (low light, one-handed, mid-patrol), turning friction points into hard requirements: dark-by-default, high-contrast, no horizontal scroll.</w:t>
+      </w:r>
+    </w:p>
+    <w:p>
+      <w:pPr>
+        <w:pStyle w:val="ListParagraph"/>
+        <w:numPr>
+          <w:ilvl w:val="0"/>
+          <w:numId w:val="2"/>
+        </w:numPr>
+        <w:spacing w:after="80"/>
+      </w:pPr>
+      <w:r>
+        <w:rPr>
+          <w:rFonts w:ascii="Arial" w:cs="Arial" w:eastAsia="Arial" w:hAnsi="Arial"/>
+          <w:sz w:val="18"/>
+          <w:szCs w:val="18"/>
+        </w:rPr>
+        <w:t xml:space="preserve">V1 to V2 self-correction: my own visually-impressive dark theme tested as unreadable on a long shift. I reversed it, stripping styling back and prioritizing readability over aesthetics based on user feedback.</w:t>
+      </w:r>
+    </w:p>
+    <w:p>
+      <w:pPr>
+        <w:pStyle w:val="ListParagraph"/>
+        <w:numPr>
+          <w:ilvl w:val="0"/>
+          <w:numId w:val="2"/>
+        </w:numPr>
+        <w:spacing w:after="80"/>
+      </w:pPr>
+      <w:r>
+        <w:rPr>
+          <w:rFonts w:ascii="Arial" w:cs="Arial" w:eastAsia="Arial" w:hAnsi="Arial"/>
+          <w:sz w:val="18"/>
+          <w:szCs w:val="18"/>
+        </w:rPr>
+        <w:t xml:space="preserve">Designed the access model around a governing principle drawn from a failed chat-tool rollout (“zero-friction access beats feature richness”): a passwordless guard-picker identity layer with no email, no app store, under five seconds.</w:t>
+      </w:r>
+    </w:p>
+    <w:p>
+      <w:pPr>
+        <w:pStyle w:val="ListParagraph"/>
+        <w:numPr>
+          <w:ilvl w:val="0"/>
+          <w:numId w:val="2"/>
+        </w:numPr>
+        <w:spacing w:after="80"/>
+      </w:pPr>
+      <w:r>
+        <w:rPr>
+          <w:rFonts w:ascii="Arial" w:cs="Arial" w:eastAsia="Arial" w:hAnsi="Arial"/>
+          <w:sz w:val="18"/>
+          <w:szCs w:val="18"/>
+        </w:rPr>
+        <w:t xml:space="preserve">Inverse design judgment: deliberately added friction, employee-ID re-entry to confirm fire-extinguisher inspections, because a careless tap on a safety record is real-world harm, not a UI annoyance.</w:t>
+      </w:r>
+    </w:p>
+    <w:p>
+      <w:pPr>
+        <w:pStyle w:val="ListParagraph"/>
+        <w:numPr>
+          <w:ilvl w:val="0"/>
+          <w:numId w:val="2"/>
+        </w:numPr>
+        <w:spacing w:after="80"/>
+      </w:pPr>
+      <w:r>
+        <w:rPr>
+          <w:rFonts w:ascii="Arial" w:cs="Arial" w:eastAsia="Arial" w:hAnsi="Arial"/>
+          <w:sz w:val="18"/>
+          <w:szCs w:val="18"/>
+        </w:rPr>
+        <w:t xml:space="preserve">Constraint-based scheduling engine honoring 5 to 7 simultaneous rules; rebuilt the data architecture after a decoupling bug, adopting incremental single-transformation validation as a method.</w:t>
       </w:r>
     </w:p>
     <w:p>
@@ -470,43 +470,43 @@
           <w:sz w:val="18"/>
           <w:szCs w:val="18"/>
         </w:rPr>
-        <w:t xml:space="preserve">MetroPlex Match — compatibility-first dating platform (205+ users); product framing of “optimize for compatibility, not swipes.”</w:t>
-      </w:r>
-    </w:p>
-    <w:p>
-      <w:pPr>
-        <w:pStyle w:val="ListParagraph"/>
-        <w:numPr>
-          <w:ilvl w:val="0"/>
-          <w:numId w:val="2"/>
-        </w:numPr>
-        <w:spacing w:after="80"/>
-      </w:pPr>
-      <w:r>
-        <w:rPr>
-          <w:rFonts w:ascii="Arial" w:cs="Arial" w:eastAsia="Arial" w:hAnsi="Arial"/>
-          <w:sz w:val="18"/>
-          <w:szCs w:val="18"/>
-        </w:rPr>
-        <w:t xml:space="preserve">Trip Buddy — AI travel companion with a modular wardrobe/outfit system and voice concierge; built over 14 sessions and used personally on a real cruise.</w:t>
-      </w:r>
-    </w:p>
-    <w:p>
-      <w:pPr>
-        <w:pStyle w:val="ListParagraph"/>
-        <w:numPr>
-          <w:ilvl w:val="0"/>
-          <w:numId w:val="2"/>
-        </w:numPr>
-        <w:spacing w:after="80"/>
-      </w:pPr>
-      <w:r>
-        <w:rPr>
-          <w:rFonts w:ascii="Arial" w:cs="Arial" w:eastAsia="Arial" w:hAnsi="Arial"/>
-          <w:sz w:val="18"/>
-          <w:szCs w:val="18"/>
-        </w:rPr>
-        <w:t xml:space="preserve">Push Coach — SMS accountability coaching; FollowThisModel — AI-twin communication platform with beta users; Sophia AI — the voice-first assistant foundation behind several products.</w:t>
+        <w:t xml:space="preserve">MetroPlex Match: compatibility-first dating platform (205+ users); product framing of “optimize for compatibility, not swipes.”</w:t>
+      </w:r>
+    </w:p>
+    <w:p>
+      <w:pPr>
+        <w:pStyle w:val="ListParagraph"/>
+        <w:numPr>
+          <w:ilvl w:val="0"/>
+          <w:numId w:val="2"/>
+        </w:numPr>
+        <w:spacing w:after="80"/>
+      </w:pPr>
+      <w:r>
+        <w:rPr>
+          <w:rFonts w:ascii="Arial" w:cs="Arial" w:eastAsia="Arial" w:hAnsi="Arial"/>
+          <w:sz w:val="18"/>
+          <w:szCs w:val="18"/>
+        </w:rPr>
+        <w:t xml:space="preserve">Trip Buddy: AI travel companion with a modular wardrobe/outfit system and voice concierge; built over 14 sessions and used personally on a real cruise.</w:t>
+      </w:r>
+    </w:p>
+    <w:p>
+      <w:pPr>
+        <w:pStyle w:val="ListParagraph"/>
+        <w:numPr>
+          <w:ilvl w:val="0"/>
+          <w:numId w:val="2"/>
+        </w:numPr>
+        <w:spacing w:after="80"/>
+      </w:pPr>
+      <w:r>
+        <w:rPr>
+          <w:rFonts w:ascii="Arial" w:cs="Arial" w:eastAsia="Arial" w:hAnsi="Arial"/>
+          <w:sz w:val="18"/>
+          <w:szCs w:val="18"/>
+        </w:rPr>
+        <w:t xml:space="preserve">Push Coach: SMS accountability coaching. FollowThisModel: AI-twin communication platform with beta users. Sophia AI: the voice-first assistant foundation behind several products.</w:t>
       </w:r>
     </w:p>
     <w:p>
@@ -532,66 +532,210 @@
     </w:p>
     <w:p>
       <w:pPr>
-        <w:spacing w:after="80"/>
-      </w:pPr>
-      <w:r>
-        <w:rPr>
-          <w:rFonts w:ascii="Arial" w:cs="Arial" w:eastAsia="Arial" w:hAnsi="Arial"/>
-          <w:b/>
-          <w:bCs/>
-          <w:color w:val="1A1A2E"/>
-          <w:sz w:val="19"/>
-          <w:szCs w:val="19"/>
-        </w:rPr>
-        <w:t xml:space="preserve">Design   </w:t>
-      </w:r>
-      <w:r>
-        <w:rPr>
-          <w:rFonts w:ascii="Arial" w:cs="Arial" w:eastAsia="Arial" w:hAnsi="Arial"/>
-          <w:sz w:val="19"/>
-          <w:szCs w:val="19"/>
-        </w:rPr>
-        <w:t xml:space="preserve">User research framing, information architecture, interaction &amp; visual design, conversation/AI UX design, content strategy &amp; microcopy, accessibility (WCAG, reduced-motion), wireframing, prototyping, usability iteration</w:t>
-      </w:r>
-    </w:p>
-    <w:p>
-      <w:pPr>
-        <w:spacing w:after="80"/>
-      </w:pPr>
-      <w:r>
-        <w:rPr>
-          <w:rFonts w:ascii="Arial" w:cs="Arial" w:eastAsia="Arial" w:hAnsi="Arial"/>
-          <w:b/>
-          <w:bCs/>
-          <w:color w:val="1A1A2E"/>
-          <w:sz w:val="19"/>
-          <w:szCs w:val="19"/>
-        </w:rPr>
-        <w:t xml:space="preserve">Build   </w:t>
-      </w:r>
-      <w:r>
-        <w:rPr>
-          <w:rFonts w:ascii="Arial" w:cs="Arial" w:eastAsia="Arial" w:hAnsi="Arial"/>
-          <w:sz w:val="19"/>
-          <w:szCs w:val="19"/>
-        </w:rPr>
-        <w:t xml:space="preserve">React, TypeScript, Tailwind, Framer Motion; Supabase (schema &amp; RLS), n8n automation, Cloudflare (Pages/DNS/Workers); AI integration (Anthropic Claude API, OpenAI, agent/tool design); Figma; Git</w:t>
-      </w:r>
-    </w:p>
-    <w:p>
-      <w:pPr>
-        <w:spacing w:after="80"/>
-      </w:pPr>
-      <w:r>
-        <w:rPr>
-          <w:rFonts w:ascii="Arial" w:cs="Arial" w:eastAsia="Arial" w:hAnsi="Arial"/>
-          <w:b/>
-          <w:bCs/>
-          <w:color w:val="1A1A2E"/>
-          <w:sz w:val="19"/>
-          <w:szCs w:val="19"/>
-        </w:rPr>
-        <w:t xml:space="preserve">Approach   </w:t>
+        <w:tabs>
+          <w:tab w:val="left" w:pos="1800"/>
+        </w:tabs>
+        <w:spacing w:after="100"/>
+        <w:ind w:left="1800" w:hanging="1800"/>
+      </w:pPr>
+      <w:r>
+        <w:rPr>
+          <w:rFonts w:ascii="Arial" w:cs="Arial" w:eastAsia="Arial" w:hAnsi="Arial"/>
+          <w:b/>
+          <w:bCs/>
+          <w:color w:val="1A1A2E"/>
+          <w:sz w:val="19"/>
+          <w:szCs w:val="19"/>
+        </w:rPr>
+        <w:t xml:space="preserve">Frontend</w:t>
+      </w:r>
+      <w:r>
+        <w:rPr>
+          <w:rFonts w:ascii="Arial" w:cs="Arial" w:eastAsia="Arial" w:hAnsi="Arial"/>
+          <w:sz w:val="19"/>
+          <w:szCs w:val="19"/>
+        </w:rPr>
+        <w:t xml:space="preserve">	</w:t>
+      </w:r>
+      <w:r>
+        <w:rPr>
+          <w:rFonts w:ascii="Arial" w:cs="Arial" w:eastAsia="Arial" w:hAnsi="Arial"/>
+          <w:sz w:val="19"/>
+          <w:szCs w:val="19"/>
+        </w:rPr>
+        <w:t xml:space="preserve">React, TypeScript, Next.js, Tailwind CSS, Framer Motion, GSAP, responsive design</w:t>
+      </w:r>
+    </w:p>
+    <w:p>
+      <w:pPr>
+        <w:tabs>
+          <w:tab w:val="left" w:pos="1800"/>
+        </w:tabs>
+        <w:spacing w:after="100"/>
+        <w:ind w:left="1800" w:hanging="1800"/>
+      </w:pPr>
+      <w:r>
+        <w:rPr>
+          <w:rFonts w:ascii="Arial" w:cs="Arial" w:eastAsia="Arial" w:hAnsi="Arial"/>
+          <w:b/>
+          <w:bCs/>
+          <w:color w:val="1A1A2E"/>
+          <w:sz w:val="19"/>
+          <w:szCs w:val="19"/>
+        </w:rPr>
+        <w:t xml:space="preserve">Backend &amp; APIs</w:t>
+      </w:r>
+      <w:r>
+        <w:rPr>
+          <w:rFonts w:ascii="Arial" w:cs="Arial" w:eastAsia="Arial" w:hAnsi="Arial"/>
+          <w:sz w:val="19"/>
+          <w:szCs w:val="19"/>
+        </w:rPr>
+        <w:t xml:space="preserve">	</w:t>
+      </w:r>
+      <w:r>
+        <w:rPr>
+          <w:rFonts w:ascii="Arial" w:cs="Arial" w:eastAsia="Arial" w:hAnsi="Arial"/>
+          <w:sz w:val="19"/>
+          <w:szCs w:val="19"/>
+        </w:rPr>
+        <w:t xml:space="preserve">Node.js, Express, Supabase, PostgreSQL, REST APIs, edge functions, webhooks</w:t>
+      </w:r>
+    </w:p>
+    <w:p>
+      <w:pPr>
+        <w:tabs>
+          <w:tab w:val="left" w:pos="1800"/>
+        </w:tabs>
+        <w:spacing w:after="100"/>
+        <w:ind w:left="1800" w:hanging="1800"/>
+      </w:pPr>
+      <w:r>
+        <w:rPr>
+          <w:rFonts w:ascii="Arial" w:cs="Arial" w:eastAsia="Arial" w:hAnsi="Arial"/>
+          <w:b/>
+          <w:bCs/>
+          <w:color w:val="1A1A2E"/>
+          <w:sz w:val="19"/>
+          <w:szCs w:val="19"/>
+        </w:rPr>
+        <w:t xml:space="preserve">AI &amp; ML</w:t>
+      </w:r>
+      <w:r>
+        <w:rPr>
+          <w:rFonts w:ascii="Arial" w:cs="Arial" w:eastAsia="Arial" w:hAnsi="Arial"/>
+          <w:sz w:val="19"/>
+          <w:szCs w:val="19"/>
+        </w:rPr>
+        <w:t xml:space="preserve">	</w:t>
+      </w:r>
+      <w:r>
+        <w:rPr>
+          <w:rFonts w:ascii="Arial" w:cs="Arial" w:eastAsia="Arial" w:hAnsi="Arial"/>
+          <w:sz w:val="19"/>
+          <w:szCs w:val="19"/>
+        </w:rPr>
+        <w:t xml:space="preserve">Anthropic Claude API, OpenAI API, prompt engineering, AI agents, RAG, vector search, n8n AI workflows</w:t>
+      </w:r>
+    </w:p>
+    <w:p>
+      <w:pPr>
+        <w:tabs>
+          <w:tab w:val="left" w:pos="1800"/>
+        </w:tabs>
+        <w:spacing w:after="100"/>
+        <w:ind w:left="1800" w:hanging="1800"/>
+      </w:pPr>
+      <w:r>
+        <w:rPr>
+          <w:rFonts w:ascii="Arial" w:cs="Arial" w:eastAsia="Arial" w:hAnsi="Arial"/>
+          <w:b/>
+          <w:bCs/>
+          <w:color w:val="1A1A2E"/>
+          <w:sz w:val="19"/>
+          <w:szCs w:val="19"/>
+        </w:rPr>
+        <w:t xml:space="preserve">Infrastructure</w:t>
+      </w:r>
+      <w:r>
+        <w:rPr>
+          <w:rFonts w:ascii="Arial" w:cs="Arial" w:eastAsia="Arial" w:hAnsi="Arial"/>
+          <w:sz w:val="19"/>
+          <w:szCs w:val="19"/>
+        </w:rPr>
+        <w:t xml:space="preserve">	</w:t>
+      </w:r>
+      <w:r>
+        <w:rPr>
+          <w:rFonts w:ascii="Arial" w:cs="Arial" w:eastAsia="Arial" w:hAnsi="Arial"/>
+          <w:sz w:val="19"/>
+          <w:szCs w:val="19"/>
+        </w:rPr>
+        <w:t xml:space="preserve">Cloudflare (Pages/DNS/Workers), Supabase Auth &amp; Storage, DNS management, CI/CD, GitHub, Vercel</w:t>
+      </w:r>
+    </w:p>
+    <w:p>
+      <w:pPr>
+        <w:tabs>
+          <w:tab w:val="left" w:pos="1800"/>
+        </w:tabs>
+        <w:spacing w:after="100"/>
+        <w:ind w:left="1800" w:hanging="1800"/>
+      </w:pPr>
+      <w:r>
+        <w:rPr>
+          <w:rFonts w:ascii="Arial" w:cs="Arial" w:eastAsia="Arial" w:hAnsi="Arial"/>
+          <w:b/>
+          <w:bCs/>
+          <w:color w:val="1A1A2E"/>
+          <w:sz w:val="19"/>
+          <w:szCs w:val="19"/>
+        </w:rPr>
+        <w:t xml:space="preserve">Design</w:t>
+      </w:r>
+      <w:r>
+        <w:rPr>
+          <w:rFonts w:ascii="Arial" w:cs="Arial" w:eastAsia="Arial" w:hAnsi="Arial"/>
+          <w:sz w:val="19"/>
+          <w:szCs w:val="19"/>
+        </w:rPr>
+        <w:t xml:space="preserve">	</w:t>
+      </w:r>
+      <w:r>
+        <w:rPr>
+          <w:rFonts w:ascii="Arial" w:cs="Arial" w:eastAsia="Arial" w:hAnsi="Arial"/>
+          <w:sz w:val="19"/>
+          <w:szCs w:val="19"/>
+        </w:rPr>
+        <w:t xml:space="preserve">User research framing, information architecture, interaction &amp; visual design, conversation/AI UX, content strategy &amp; microcopy, accessibility (WCAG, reduced-motion), wireframing, prototyping, usability iteration</w:t>
+      </w:r>
+    </w:p>
+    <w:p>
+      <w:pPr>
+        <w:tabs>
+          <w:tab w:val="left" w:pos="1800"/>
+        </w:tabs>
+        <w:spacing w:after="100"/>
+        <w:ind w:left="1800" w:hanging="1800"/>
+      </w:pPr>
+      <w:r>
+        <w:rPr>
+          <w:rFonts w:ascii="Arial" w:cs="Arial" w:eastAsia="Arial" w:hAnsi="Arial"/>
+          <w:b/>
+          <w:bCs/>
+          <w:color w:val="1A1A2E"/>
+          <w:sz w:val="19"/>
+          <w:szCs w:val="19"/>
+        </w:rPr>
+        <w:t xml:space="preserve">Approach</w:t>
+      </w:r>
+      <w:r>
+        <w:rPr>
+          <w:rFonts w:ascii="Arial" w:cs="Arial" w:eastAsia="Arial" w:hAnsi="Arial"/>
+          <w:sz w:val="19"/>
+          <w:szCs w:val="19"/>
+        </w:rPr>
+        <w:t xml:space="preserve">	</w:t>
       </w:r>
       <w:r>
         <w:rPr>

</xml_diff>